<commit_message>
Vertragswerk: kombinierte Word-Datei + Firmenname/Telefon in allen Dokumenten korrigiert
- NexAI-Vertragswerk_komplett.docx neu: alle 8 Dokumente als eine editierbare
  Word-Datei (aus den JSON-Quellen gerendert, mit Seitenumbruechen)
- Stammdaten in 7 JSON-Quellen korrigiert: "Next Generation Artificial
  Intelligence GbR" (Namenskorrektur 29.07.) + Tel. 0176 80714816
- Alle Einzeldokumente (Word+PDF) und komplett.pdf neu erzeugt (59 S.)

Co-Authored-By: Claude Fable 5 <noreply@anthropic.com>
</commit_message>
<xml_diff>
--- a/vertrag/01_Rahmen-Dienstleistungsvertrag.docx
+++ b/vertrag/01_Rahmen-Dienstleistungsvertrag.docx
@@ -128,20 +128,20 @@
           <w:sz w:val="21"/>
           <w:szCs w:val="21"/>
         </w:rPr>
-        <w:t xml:space="preserve">NexAI – Next Generation Intelligence GbR</w:t>
-      </w:r>
-      <w:r>
-        <w:rPr>
-          <w:rFonts w:ascii="Arial" w:cs="Arial" w:eastAsia="Arial" w:hAnsi="Arial"/>
-          <w:b w:val="false"/>
-          <w:bCs w:val="false"/>
-          <w:i w:val="false"/>
-          <w:iCs w:val="false"/>
-          <w:color w:val="1A1A1A"/>
-          <w:sz w:val="21"/>
-          <w:szCs w:val="21"/>
-        </w:rPr>
-        <w:t xml:space="preserve">, Untere Bergstraße 13, 74586 Frankenhardt-Honhardt, Deutschland, vertreten durch die Gesellschafter Maximilian Trenk und Jason Brian Merklein, E-Mail mbt@nex-a-i.com, Telefon 0176 20147646 — nachfolgend </w:t>
+        <w:t xml:space="preserve">NexAI – Next Generation Artificial Intelligence GbR</w:t>
+      </w:r>
+      <w:r>
+        <w:rPr>
+          <w:rFonts w:ascii="Arial" w:cs="Arial" w:eastAsia="Arial" w:hAnsi="Arial"/>
+          <w:b w:val="false"/>
+          <w:bCs w:val="false"/>
+          <w:i w:val="false"/>
+          <w:iCs w:val="false"/>
+          <w:color w:val="1A1A1A"/>
+          <w:sz w:val="21"/>
+          <w:szCs w:val="21"/>
+        </w:rPr>
+        <w:t xml:space="preserve">, Untere Bergstraße 13, 74586 Frankenhardt-Honhardt, Deutschland, vertreten durch die Gesellschafter Maximilian Trenk und Jason Brian Merklein, E-Mail mbt@nex-a-i.com, Telefon 0176 80714816 — nachfolgend </w:t>
       </w:r>
       <w:r>
         <w:rPr>
@@ -7587,7 +7587,7 @@
         <w:sz w:val="15"/>
         <w:szCs w:val="15"/>
       </w:rPr>
-      <w:t xml:space="preserve">NexAI – Next Generation Intelligence GbR</w:t>
+      <w:t xml:space="preserve">NexAI – Next Generation Artificial Intelligence GbR</w:t>
     </w:r>
     <w:r>
       <w:rPr>

</xml_diff>